<commit_message>
docs: the gate's file count was already two out, so state it as a snapshot
The passage said check:file-size measures 330 code files. Adding the endpoint
counter and its spec made it 332 before the commit that introduced the
sentence had even been pushed — a figure that moves with the tree quoted as
though it were fixed.

Restated as what it is: every code file under src, scripts, tools and demo,
332 at this issue, printed on every run rather than quoted from the document.
The gate prints the number itself, so there is no reason for this file to be
the place anybody reads it.

Co-Authored-By: Claude Opus 5 <noreply@anthropic.com>
Claude-Session: https://claude.ai/code/session_01M5ydF6smpAHik9kEbxV7DW
Signed-off-by: Claude <noreply@anthropic.com>
</commit_message>
<xml_diff>
--- a/docs/Viewer-Product-Technical-Architecture.docx
+++ b/docs/Viewer-Product-Technical-Architecture.docx
@@ -4868,7 +4868,111 @@
           <w:sz w:val="21"/>
           <w:szCs w:val="21"/>
         </w:rPr>
-        <w:t xml:space="preserve"> now measures them over 330 code files, runs as </w:t>
+        <w:t xml:space="preserve"> now measures them over every code file under </w:t>
+      </w:r>
+      <w:r>
+        <w:rPr>
+          <w:rFonts w:ascii="Consolas" w:cs="Consolas" w:eastAsia="Consolas" w:hAnsi="Consolas"/>
+          <w:b w:val="false"/>
+          <w:bCs w:val="false"/>
+          <w:i w:val="false"/>
+          <w:iCs w:val="false"/>
+          <w:color w:val="1B2027"/>
+          <w:sz w:val="19"/>
+          <w:szCs w:val="19"/>
+        </w:rPr>
+        <w:t xml:space="preserve">src</w:t>
+      </w:r>
+      <w:r>
+        <w:rPr>
+          <w:rFonts w:ascii="Calibri" w:cs="Calibri" w:eastAsia="Calibri" w:hAnsi="Calibri"/>
+          <w:b w:val="false"/>
+          <w:bCs w:val="false"/>
+          <w:i w:val="false"/>
+          <w:iCs w:val="false"/>
+          <w:color w:val="1B2027"/>
+          <w:sz w:val="21"/>
+          <w:szCs w:val="21"/>
+        </w:rPr>
+        <w:t xml:space="preserve">, </w:t>
+      </w:r>
+      <w:r>
+        <w:rPr>
+          <w:rFonts w:ascii="Consolas" w:cs="Consolas" w:eastAsia="Consolas" w:hAnsi="Consolas"/>
+          <w:b w:val="false"/>
+          <w:bCs w:val="false"/>
+          <w:i w:val="false"/>
+          <w:iCs w:val="false"/>
+          <w:color w:val="1B2027"/>
+          <w:sz w:val="19"/>
+          <w:szCs w:val="19"/>
+        </w:rPr>
+        <w:t xml:space="preserve">scripts</w:t>
+      </w:r>
+      <w:r>
+        <w:rPr>
+          <w:rFonts w:ascii="Calibri" w:cs="Calibri" w:eastAsia="Calibri" w:hAnsi="Calibri"/>
+          <w:b w:val="false"/>
+          <w:bCs w:val="false"/>
+          <w:i w:val="false"/>
+          <w:iCs w:val="false"/>
+          <w:color w:val="1B2027"/>
+          <w:sz w:val="21"/>
+          <w:szCs w:val="21"/>
+        </w:rPr>
+        <w:t xml:space="preserve">, </w:t>
+      </w:r>
+      <w:r>
+        <w:rPr>
+          <w:rFonts w:ascii="Consolas" w:cs="Consolas" w:eastAsia="Consolas" w:hAnsi="Consolas"/>
+          <w:b w:val="false"/>
+          <w:bCs w:val="false"/>
+          <w:i w:val="false"/>
+          <w:iCs w:val="false"/>
+          <w:color w:val="1B2027"/>
+          <w:sz w:val="19"/>
+          <w:szCs w:val="19"/>
+        </w:rPr>
+        <w:t xml:space="preserve">tools</w:t>
+      </w:r>
+      <w:r>
+        <w:rPr>
+          <w:rFonts w:ascii="Calibri" w:cs="Calibri" w:eastAsia="Calibri" w:hAnsi="Calibri"/>
+          <w:b w:val="false"/>
+          <w:bCs w:val="false"/>
+          <w:i w:val="false"/>
+          <w:iCs w:val="false"/>
+          <w:color w:val="1B2027"/>
+          <w:sz w:val="21"/>
+          <w:szCs w:val="21"/>
+        </w:rPr>
+        <w:t xml:space="preserve"> and </w:t>
+      </w:r>
+      <w:r>
+        <w:rPr>
+          <w:rFonts w:ascii="Consolas" w:cs="Consolas" w:eastAsia="Consolas" w:hAnsi="Consolas"/>
+          <w:b w:val="false"/>
+          <w:bCs w:val="false"/>
+          <w:i w:val="false"/>
+          <w:iCs w:val="false"/>
+          <w:color w:val="1B2027"/>
+          <w:sz w:val="19"/>
+          <w:szCs w:val="19"/>
+        </w:rPr>
+        <w:t xml:space="preserve">demo</w:t>
+      </w:r>
+      <w:r>
+        <w:rPr>
+          <w:rFonts w:ascii="Calibri" w:cs="Calibri" w:eastAsia="Calibri" w:hAnsi="Calibri"/>
+          <w:b w:val="false"/>
+          <w:bCs w:val="false"/>
+          <w:i w:val="false"/>
+          <w:iCs w:val="false"/>
+          <w:color w:val="1B2027"/>
+          <w:sz w:val="21"/>
+          <w:szCs w:val="21"/>
+        </w:rPr>
+        <w:t xml:space="preserve"> — 332 of them at this issue, a figure that moves with the tree and is printed on every run rather than quoted from here. It runs as </w:t>
       </w:r>
       <w:r>
         <w:rPr>
@@ -4894,7 +4998,7 @@
           <w:sz w:val="21"/>
           <w:szCs w:val="21"/>
         </w:rPr>
-        <w:t xml:space="preserve">, and is wired into the pipeline’s static analysis stage.</w:t>
+        <w:t xml:space="preserve"> and is wired into the pipeline’s static analysis stage.</w:t>
       </w:r>
     </w:p>
     <w:p>

</xml_diff>